<commit_message>
fix(panduan): cara screenshot dashboard tanpa GUI di Ubuntu Server
- ganti instruksi keliru 'buka Firefox di VM Target' dengan 3 cara: skrip otomatis, SSH tunnel manual, atau dari Kali
- tambah scripts/docs/screenshot_dashboard.py (SSH tunnel + Chrome headless, set cookie sesi tanpa mengetik kredensial)
- bukti nyata: evidence/BUKTI_dashboard.png + BUKTI_login.png (diverifikasi tampil 6 kambing, 31.3 kg, 8.78 kg)
- catat kenapa port-forward 8080 lewat NAT tidak bisa dipakai (ufw hanya izinkan 80 dari 192.168.4.0/24)
- rebuild panduan docx/pdf
</commit_message>
<xml_diff>
--- a/docs/Panduan-Checkpoint-Pertemuan9-TEK1314-Kelompok4.docx
+++ b/docs/Panduan-Checkpoint-Pertemuan9-TEK1314-Kelompok4.docx
@@ -2272,6 +2272,302 @@
         <w:pStyle w:val="Heading2"/>
       </w:pPr>
       <w:r>
+        <w:t>Screenshot dashboard tanpa GUI</w:t>
+      </w:r>
+    </w:p>
+    <w:p>
+      <w:r>
+        <w:rPr>
+          <w:sz w:val="19"/>
+        </w:rPr>
+        <w:t xml:space="preserve">Ubuntu Server tidak memasang desktop, jadi </w:t>
+      </w:r>
+      <w:r>
+        <w:rPr>
+          <w:b/>
+        </w:rPr>
+        <w:t>jangan</w:t>
+      </w:r>
+      <w:r>
+        <w:rPr>
+          <w:sz w:val="19"/>
+        </w:rPr>
+        <w:t xml:space="preserve"> mencari Firefox/Chrome di VM Target.</w:t>
+      </w:r>
+    </w:p>
+    <w:p>
+      <w:r>
+        <w:rPr>
+          <w:sz w:val="19"/>
+        </w:rPr>
+        <w:t>Ada tiga cara yang benar:</w:t>
+      </w:r>
+    </w:p>
+    <w:p>
+      <w:pPr>
+        <w:pStyle w:val="Heading3"/>
+      </w:pPr>
+      <w:r>
+        <w:t>Cara 1 — skrip otomatis (paling cepat, dari Windows)</w:t>
+      </w:r>
+    </w:p>
+    <w:p>
+      <w:pPr>
+        <w:spacing w:before="40" w:after="120"/>
+        <w:ind w:left="227"/>
+      </w:pPr>
+      <w:r>
+        <w:rPr>
+          <w:rFonts w:ascii="Consolas" w:hAnsi="Consolas"/>
+          <w:sz w:val="16"/>
+        </w:rPr>
+        <w:t># [HOST] sekali saja</w:t>
+        <w:br/>
+      </w:r>
+      <w:r>
+        <w:rPr>
+          <w:rFonts w:ascii="Consolas" w:hAnsi="Consolas"/>
+          <w:sz w:val="16"/>
+        </w:rPr>
+        <w:t>pip install paramiko websocket-client</w:t>
+        <w:br/>
+      </w:r>
+      <w:r>
+        <w:rPr>
+          <w:rFonts w:ascii="Consolas" w:hAnsi="Consolas"/>
+          <w:sz w:val="16"/>
+        </w:rPr>
+        <w:br/>
+      </w:r>
+      <w:r>
+        <w:rPr>
+          <w:rFonts w:ascii="Consolas" w:hAnsi="Consolas"/>
+          <w:sz w:val="16"/>
+        </w:rPr>
+        <w:t># [HOST] setiap kali butuh bukti baru</w:t>
+        <w:br/>
+      </w:r>
+      <w:r>
+        <w:rPr>
+          <w:rFonts w:ascii="Consolas" w:hAnsi="Consolas"/>
+          <w:sz w:val="16"/>
+        </w:rPr>
+        <w:t>python scripts/docs/screenshot_dashboard.py</w:t>
+      </w:r>
+    </w:p>
+    <w:p>
+      <w:r>
+        <w:rPr>
+          <w:sz w:val="19"/>
+        </w:rPr>
+        <w:t xml:space="preserve">Skrip membuka SSH tunnel </w:t>
+      </w:r>
+      <w:r>
+        <w:rPr>
+          <w:rFonts w:ascii="Consolas" w:hAnsi="Consolas"/>
+          <w:sz w:val="17"/>
+        </w:rPr>
+        <w:t>127.0.0.1:8090 -&gt; 127.0.0.1:80</w:t>
+      </w:r>
+      <w:r>
+        <w:rPr>
+          <w:sz w:val="19"/>
+        </w:rPr>
+        <w:t>, menjalankan Chrome headless,</w:t>
+      </w:r>
+    </w:p>
+    <w:p>
+      <w:r>
+        <w:rPr>
+          <w:sz w:val="19"/>
+        </w:rPr>
+        <w:t xml:space="preserve">menyimpan </w:t>
+      </w:r>
+      <w:r>
+        <w:rPr>
+          <w:rFonts w:ascii="Consolas" w:hAnsi="Consolas"/>
+          <w:sz w:val="17"/>
+        </w:rPr>
+        <w:t>BUKTI_login.png</w:t>
+      </w:r>
+      <w:r>
+        <w:rPr>
+          <w:sz w:val="19"/>
+        </w:rPr>
+        <w:t xml:space="preserve"> dan </w:t>
+      </w:r>
+      <w:r>
+        <w:rPr>
+          <w:rFonts w:ascii="Consolas" w:hAnsi="Consolas"/>
+          <w:sz w:val="17"/>
+        </w:rPr>
+        <w:t>BUKTI_dashboard.png</w:t>
+      </w:r>
+      <w:r>
+        <w:rPr>
+          <w:sz w:val="19"/>
+        </w:rPr>
+        <w:t xml:space="preserve"> ke </w:t>
+      </w:r>
+      <w:r>
+        <w:rPr>
+          <w:rFonts w:ascii="Consolas" w:hAnsi="Consolas"/>
+          <w:sz w:val="17"/>
+        </w:rPr>
+        <w:t>docs/blueteam/evidence/</w:t>
+      </w:r>
+      <w:r>
+        <w:rPr>
+          <w:sz w:val="19"/>
+        </w:rPr>
+        <w:t>.</w:t>
+      </w:r>
+    </w:p>
+    <w:p>
+      <w:r>
+        <w:rPr>
+          <w:sz w:val="19"/>
+        </w:rPr>
+        <w:t>Firewall tidak diubah: traffic masuk lewat SSH, bukan lewat NAT.</w:t>
+      </w:r>
+    </w:p>
+    <w:p>
+      <w:pPr>
+        <w:pStyle w:val="Heading3"/>
+      </w:pPr>
+      <w:r>
+        <w:t>Cara 2 — SSH tunnel manual + browser Windows</w:t>
+      </w:r>
+    </w:p>
+    <w:p>
+      <w:pPr>
+        <w:spacing w:before="40" w:after="120"/>
+        <w:ind w:left="227"/>
+      </w:pPr>
+      <w:r>
+        <w:rPr>
+          <w:rFonts w:ascii="Consolas" w:hAnsi="Consolas"/>
+          <w:sz w:val="16"/>
+        </w:rPr>
+        <w:t># [HOST] terminal 1</w:t>
+        <w:br/>
+      </w:r>
+      <w:r>
+        <w:rPr>
+          <w:rFonts w:ascii="Consolas" w:hAnsi="Consolas"/>
+          <w:sz w:val="16"/>
+        </w:rPr>
+        <w:t>ssh -p 2222 -L 8090:127.0.0.1:80 iotadmin@127.0.0.1     # password: 123</w:t>
+        <w:br/>
+      </w:r>
+      <w:r>
+        <w:rPr>
+          <w:rFonts w:ascii="Consolas" w:hAnsi="Consolas"/>
+          <w:sz w:val="16"/>
+        </w:rPr>
+        <w:br/>
+      </w:r>
+      <w:r>
+        <w:rPr>
+          <w:rFonts w:ascii="Consolas" w:hAnsi="Consolas"/>
+          <w:sz w:val="16"/>
+        </w:rPr>
+        <w:t># [HOST] lalu buka di browser Windows</w:t>
+        <w:br/>
+      </w:r>
+      <w:r>
+        <w:rPr>
+          <w:rFonts w:ascii="Consolas" w:hAnsi="Consolas"/>
+          <w:sz w:val="16"/>
+        </w:rPr>
+        <w:t>#   http://127.0.0.1:8090        login admin / admin123</w:t>
+        <w:br/>
+      </w:r>
+      <w:r>
+        <w:rPr>
+          <w:rFonts w:ascii="Consolas" w:hAnsi="Consolas"/>
+          <w:sz w:val="16"/>
+        </w:rPr>
+        <w:t>#   tekan Win+Shift+S untuk menangkap layar, simpan ke docs/blueteam/evidence/</w:t>
+      </w:r>
+    </w:p>
+    <w:p>
+      <w:r>
+        <w:rPr>
+          <w:sz w:val="19"/>
+        </w:rPr>
+        <w:t xml:space="preserve">Port 8080 lewat NAT </w:t>
+      </w:r>
+      <w:r>
+        <w:rPr>
+          <w:b/>
+        </w:rPr>
+        <w:t>tidak bisa</w:t>
+      </w:r>
+      <w:r>
+        <w:rPr>
+          <w:sz w:val="19"/>
+        </w:rPr>
+        <w:t xml:space="preserve"> dipakai: ufw hanya mengizinkan port 80 dari</w:t>
+      </w:r>
+    </w:p>
+    <w:p>
+      <w:r>
+        <w:rPr>
+          <w:rFonts w:ascii="Consolas" w:hAnsi="Consolas"/>
+          <w:sz w:val="17"/>
+        </w:rPr>
+        <w:t>192.168.4.0/24</w:t>
+      </w:r>
+      <w:r>
+        <w:rPr>
+          <w:sz w:val="19"/>
+        </w:rPr>
+        <w:t>, sehingga request dari host (10.0.3.x) diblokir.</w:t>
+      </w:r>
+    </w:p>
+    <w:p>
+      <w:pPr>
+        <w:pStyle w:val="Heading3"/>
+      </w:pPr>
+      <w:r>
+        <w:t>Cara 3 — dari Attacker Node (paling "seperti penyerang melihat")</w:t>
+      </w:r>
+    </w:p>
+    <w:p>
+      <w:pPr>
+        <w:spacing w:before="40" w:after="120"/>
+        <w:ind w:left="227"/>
+      </w:pPr>
+      <w:r>
+        <w:rPr>
+          <w:rFonts w:ascii="Consolas" w:hAnsi="Consolas"/>
+          <w:sz w:val="16"/>
+        </w:rPr>
+        <w:t># [KALI] desktop Kali punya Firefox</w:t>
+        <w:br/>
+      </w:r>
+      <w:r>
+        <w:rPr>
+          <w:rFonts w:ascii="Consolas" w:hAnsi="Consolas"/>
+          <w:sz w:val="16"/>
+        </w:rPr>
+        <w:t>firefox http://192.168.4.5        # login admin / admin123, lalu tangkap layar</w:t>
+      </w:r>
+    </w:p>
+    <w:p>
+      <w:r>
+        <w:rPr>
+          <w:sz w:val="19"/>
+        </w:rPr>
+        <w:t>Gunakan cara 3 kalau dosen meminta bukti tampilan dari sudut pandang penyerang.</w:t>
+      </w:r>
+    </w:p>
+    <w:p>
+      <w:pPr>
+        <w:pStyle w:val="Heading2"/>
+      </w:pPr>
+      <w:r>
         <w:t>Yang harus kamu kerjakan sendiri (tidak bisa diotomasi)</w:t>
       </w:r>
     </w:p>
@@ -2403,46 +2699,19 @@
               <w:rPr>
                 <w:sz w:val="16"/>
               </w:rPr>
-              <w:t xml:space="preserve">Buka Firefox/Chrome di VM Target: </w:t>
+              <w:t xml:space="preserve">Ubuntu Server tidak punya browser. Pakai salah satu cara di bagian </w:t>
             </w:r>
             <w:r>
               <w:rPr>
-                <w:rFonts w:ascii="Consolas" w:hAnsi="Consolas"/>
-                <w:sz w:val="17"/>
+                <w:b/>
               </w:rPr>
-              <w:t>http://127.0.0.1/</w:t>
+              <w:t>Screenshot dashboard tanpa GUI</w:t>
             </w:r>
             <w:r>
               <w:rPr>
                 <w:sz w:val="16"/>
               </w:rPr>
-              <w:t xml:space="preserve">, login </w:t>
-            </w:r>
-            <w:r>
-              <w:rPr>
-                <w:rFonts w:ascii="Consolas" w:hAnsi="Consolas"/>
-                <w:sz w:val="17"/>
-              </w:rPr>
-              <w:t>admin</w:t>
-            </w:r>
-            <w:r>
-              <w:rPr>
-                <w:sz w:val="16"/>
-              </w:rPr>
-              <w:t xml:space="preserve"> / </w:t>
-            </w:r>
-            <w:r>
-              <w:rPr>
-                <w:rFonts w:ascii="Consolas" w:hAnsi="Consolas"/>
-                <w:sz w:val="17"/>
-              </w:rPr>
-              <w:t>admin123</w:t>
-            </w:r>
-            <w:r>
-              <w:rPr>
-                <w:sz w:val="16"/>
-              </w:rPr>
-              <w:t xml:space="preserve">, tangkap layar, simpan </w:t>
+              <w:t xml:space="preserve"> di bawah. Hasil: </w:t>
             </w:r>
             <w:r>
               <w:rPr>
@@ -2450,6 +2719,12 @@
                 <w:sz w:val="17"/>
               </w:rPr>
               <w:t>docs/blueteam/evidence/BUKTI_dashboard.png</w:t>
+            </w:r>
+            <w:r>
+              <w:rPr>
+                <w:sz w:val="16"/>
+              </w:rPr>
+              <w:t xml:space="preserve"> (sudah tersedia)</w:t>
             </w:r>
           </w:p>
         </w:tc>

</xml_diff>